<commit_message>
Update location to Muvattupuzha, Kerala, India
</commit_message>
<xml_diff>
--- a/Abdul_Rasak_M_R_Resume.docx
+++ b/Abdul_Rasak_M_R_Resume.docx
@@ -102,7 +102,7 @@
               </w:rPr>
               <w:t>📱 Mobile: +91 9447723429  |  📧 Email: rasakmar@gmail.com</w:t>
               <w:br/>
-              <w:t>📍 Location: India  |  🎓 B.Tech CSE (MG University 2012)  |  💼 11+ Yrs Exp</w:t>
+              <w:t>📍 Location: Muvattupuzha, Kerala, India  |  🎓 B.Tech CSE (MG University 2012)  |  💼 11+ Yrs Exp</w:t>
             </w:r>
           </w:p>
         </w:tc>
@@ -412,7 +412,7 @@
           <w:color w:val="0284C7"/>
           <w:sz w:val="22"/>
         </w:rPr>
-        <w:t xml:space="preserve">  |  Safecare Technologies Pvt Ltd</w:t>
+        <w:t xml:space="preserve">  |  Safecare Technologies Pvt Ltd, Muvattupuzha</w:t>
       </w:r>
     </w:p>
     <w:p>

</xml_diff>